<commit_message>
Update 周一 2026/10/26 17:22:35
</commit_message>
<xml_diff>
--- a/模板库/ku/ISO 2023.docx
+++ b/模板库/ku/ISO 2023.docx
@@ -231,7 +231,32 @@
           <w:szCs w:val="21"/>
           <w:lang w:val="en-US" w:eastAsia="zh-CN"/>
         </w:rPr>
-        <w:t>DUT以测试电压UB作为电源进行电气操作，类似于车辆中关闭内燃机、高压电池和/或直流-直流转换器断开，且所有电气连接均已建立。对于特定测试情况，可能适用其他测试电压或其他电压曲线。</w:t>
+        <w:t>DUT以测试电压U</w:t>
+      </w:r>
+      <w:r>
+        <w:rPr>
+          <w:rFonts w:hint="eastAsia" w:ascii="宋体" w:hAnsi="宋体" w:eastAsia="宋体" w:cs="宋体"/>
+          <w:b w:val="0"/>
+          <w:bCs/>
+          <w:color w:val="auto"/>
+          <w:sz w:val="21"/>
+          <w:szCs w:val="21"/>
+          <w:vertAlign w:val="subscript"/>
+          <w:lang w:val="en-US" w:eastAsia="zh-CN"/>
+        </w:rPr>
+        <w:t>B</w:t>
+      </w:r>
+      <w:r>
+        <w:rPr>
+          <w:rFonts w:hint="eastAsia" w:ascii="宋体" w:hAnsi="宋体" w:eastAsia="宋体" w:cs="宋体"/>
+          <w:b w:val="0"/>
+          <w:bCs/>
+          <w:color w:val="auto"/>
+          <w:sz w:val="21"/>
+          <w:szCs w:val="21"/>
+          <w:lang w:val="en-US" w:eastAsia="zh-CN"/>
+        </w:rPr>
+        <w:t>作为电源进行电气操作，类似于车辆中关闭内燃机、高压电池和/或直流-直流转换器断开，且所有电气连接均已建立。对于特定测试情况，可能适用其他测试电压或其他电压曲线。</w:t>
       </w:r>
     </w:p>
     <w:p>
@@ -420,7 +445,57 @@
           <w:szCs w:val="21"/>
           <w:lang w:val="en-US" w:eastAsia="zh-CN"/>
         </w:rPr>
-        <w:t>DUT由测试电压UA和UX供电，所有电气连接均已完成。但未安装辅助设备（例如冷却系统）。</w:t>
+        <w:t>DUT由测试电压U</w:t>
+      </w:r>
+      <w:r>
+        <w:rPr>
+          <w:rFonts w:hint="eastAsia" w:ascii="宋体" w:hAnsi="宋体" w:eastAsia="宋体" w:cs="宋体"/>
+          <w:b w:val="0"/>
+          <w:bCs/>
+          <w:color w:val="auto"/>
+          <w:sz w:val="21"/>
+          <w:szCs w:val="21"/>
+          <w:vertAlign w:val="subscript"/>
+          <w:lang w:val="en-US" w:eastAsia="zh-CN"/>
+        </w:rPr>
+        <w:t>A</w:t>
+      </w:r>
+      <w:r>
+        <w:rPr>
+          <w:rFonts w:hint="eastAsia" w:ascii="宋体" w:hAnsi="宋体" w:eastAsia="宋体" w:cs="宋体"/>
+          <w:b w:val="0"/>
+          <w:bCs/>
+          <w:color w:val="auto"/>
+          <w:sz w:val="21"/>
+          <w:szCs w:val="21"/>
+          <w:lang w:val="en-US" w:eastAsia="zh-CN"/>
+        </w:rPr>
+        <w:t>和U</w:t>
+      </w:r>
+      <w:r>
+        <w:rPr>
+          <w:rFonts w:hint="eastAsia" w:ascii="宋体" w:hAnsi="宋体" w:eastAsia="宋体" w:cs="宋体"/>
+          <w:b w:val="0"/>
+          <w:bCs/>
+          <w:color w:val="auto"/>
+          <w:sz w:val="21"/>
+          <w:szCs w:val="21"/>
+          <w:vertAlign w:val="subscript"/>
+          <w:lang w:val="en-US" w:eastAsia="zh-CN"/>
+        </w:rPr>
+        <w:t>X</w:t>
+      </w:r>
+      <w:r>
+        <w:rPr>
+          <w:rFonts w:hint="eastAsia" w:ascii="宋体" w:hAnsi="宋体" w:eastAsia="宋体" w:cs="宋体"/>
+          <w:b w:val="0"/>
+          <w:bCs/>
+          <w:color w:val="auto"/>
+          <w:sz w:val="21"/>
+          <w:szCs w:val="21"/>
+          <w:lang w:val="en-US" w:eastAsia="zh-CN"/>
+        </w:rPr>
+        <w:t>供电，所有电气连接均已完成。但未安装辅助设备（例如冷却系统）。</w:t>
       </w:r>
     </w:p>
     <w:p>
@@ -474,7 +549,57 @@
           <w:szCs w:val="21"/>
           <w:lang w:val="en-US" w:eastAsia="zh-CN"/>
         </w:rPr>
-        <w:t>若DUT拥有48V电路且无B类电压电路，则应使用U48N代替UX；若DUT仅有12/24V电路，则仅提供12/24V电压。为了特定的测试条件、其他测试电压或其他电压曲线可能适用。</w:t>
+        <w:t>若DUT拥有48V电路且无B类电压电路，则应使用U</w:t>
+      </w:r>
+      <w:r>
+        <w:rPr>
+          <w:rFonts w:hint="eastAsia" w:ascii="宋体" w:hAnsi="宋体" w:eastAsia="宋体" w:cs="宋体"/>
+          <w:b w:val="0"/>
+          <w:bCs/>
+          <w:color w:val="auto"/>
+          <w:sz w:val="21"/>
+          <w:szCs w:val="21"/>
+          <w:vertAlign w:val="subscript"/>
+          <w:lang w:val="en-US" w:eastAsia="zh-CN"/>
+        </w:rPr>
+        <w:t>48N</w:t>
+      </w:r>
+      <w:r>
+        <w:rPr>
+          <w:rFonts w:hint="eastAsia" w:ascii="宋体" w:hAnsi="宋体" w:eastAsia="宋体" w:cs="宋体"/>
+          <w:b w:val="0"/>
+          <w:bCs/>
+          <w:color w:val="auto"/>
+          <w:sz w:val="21"/>
+          <w:szCs w:val="21"/>
+          <w:lang w:val="en-US" w:eastAsia="zh-CN"/>
+        </w:rPr>
+        <w:t>代替U</w:t>
+      </w:r>
+      <w:r>
+        <w:rPr>
+          <w:rFonts w:hint="eastAsia" w:ascii="宋体" w:hAnsi="宋体" w:eastAsia="宋体" w:cs="宋体"/>
+          <w:b w:val="0"/>
+          <w:bCs/>
+          <w:color w:val="auto"/>
+          <w:sz w:val="21"/>
+          <w:szCs w:val="21"/>
+          <w:vertAlign w:val="subscript"/>
+          <w:lang w:val="en-US" w:eastAsia="zh-CN"/>
+        </w:rPr>
+        <w:t>X</w:t>
+      </w:r>
+      <w:r>
+        <w:rPr>
+          <w:rFonts w:hint="eastAsia" w:ascii="宋体" w:hAnsi="宋体" w:eastAsia="宋体" w:cs="宋体"/>
+          <w:b w:val="0"/>
+          <w:bCs/>
+          <w:color w:val="auto"/>
+          <w:sz w:val="21"/>
+          <w:szCs w:val="21"/>
+          <w:lang w:val="en-US" w:eastAsia="zh-CN"/>
+        </w:rPr>
+        <w:t>；若DUT仅有12/24V电路，则仅提供12/24V电压。为了特定的测试条件、其他测试电压或其他电压曲线可能适用。</w:t>
       </w:r>
     </w:p>
     <w:p>
@@ -663,7 +788,59 @@
           <w:szCs w:val="21"/>
           <w:lang w:val="en-US" w:eastAsia="zh-CN"/>
         </w:rPr>
-        <w:t>待测设备（DUT）由测试电压UA和UX通过电气连接进行电控操作。此外，还配备有辅助设备（例如冷却系统）。运行模式（最小、典型、最大）应由客户与供应商协商确定。为避免DUT过热或无法完成测试设置，客户与供应商可协商将运行模式从4.4改为4.2。</w:t>
+        <w:t>待测设备（DUT）由测试电压U</w:t>
+      </w:r>
+      <w:r>
+        <w:rPr>
+          <w:rFonts w:hint="eastAsia" w:ascii="宋体" w:hAnsi="宋体" w:eastAsia="宋体" w:cs="宋体"/>
+          <w:b w:val="0"/>
+          <w:bCs/>
+          <w:color w:val="auto"/>
+          <w:sz w:val="21"/>
+          <w:szCs w:val="21"/>
+          <w:vertAlign w:val="subscript"/>
+          <w:lang w:val="en-US" w:eastAsia="zh-CN"/>
+        </w:rPr>
+        <w:t>A</w:t>
+      </w:r>
+      <w:r>
+        <w:rPr>
+          <w:rFonts w:hint="eastAsia" w:ascii="宋体" w:hAnsi="宋体" w:eastAsia="宋体" w:cs="宋体"/>
+          <w:b w:val="0"/>
+          <w:bCs/>
+          <w:color w:val="auto"/>
+          <w:sz w:val="21"/>
+          <w:szCs w:val="21"/>
+          <w:lang w:val="en-US" w:eastAsia="zh-CN"/>
+        </w:rPr>
+        <w:t>和U</w:t>
+      </w:r>
+      <w:bookmarkStart w:id="0" w:name="_GoBack"/>
+      <w:r>
+        <w:rPr>
+          <w:rFonts w:hint="eastAsia" w:ascii="宋体" w:hAnsi="宋体" w:eastAsia="宋体" w:cs="宋体"/>
+          <w:b w:val="0"/>
+          <w:bCs/>
+          <w:color w:val="auto"/>
+          <w:sz w:val="21"/>
+          <w:szCs w:val="21"/>
+          <w:vertAlign w:val="subscript"/>
+          <w:lang w:val="en-US" w:eastAsia="zh-CN"/>
+        </w:rPr>
+        <w:t>X</w:t>
+      </w:r>
+      <w:bookmarkEnd w:id="0"/>
+      <w:r>
+        <w:rPr>
+          <w:rFonts w:hint="eastAsia" w:ascii="宋体" w:hAnsi="宋体" w:eastAsia="宋体" w:cs="宋体"/>
+          <w:b w:val="0"/>
+          <w:bCs/>
+          <w:color w:val="auto"/>
+          <w:sz w:val="21"/>
+          <w:szCs w:val="21"/>
+          <w:lang w:val="en-US" w:eastAsia="zh-CN"/>
+        </w:rPr>
+        <w:t>通过电气连接进行电控操作。此外，还配备有辅助设备（例如冷却系统）。运行模式（最小、典型、最大）应由客户与供应商协商确定。为避免DUT过热或无法完成测试设置，客户与供应商可协商将运行模式从4.4改为4.2。</w:t>
       </w:r>
     </w:p>
     <w:p>
@@ -859,8 +1036,6 @@
         </w:rPr>
         <w:t>A级：</w:t>
       </w:r>
-      <w:bookmarkStart w:id="0" w:name="_GoBack"/>
-      <w:bookmarkEnd w:id="0"/>
     </w:p>
     <w:p>
       <w:pPr>

</xml_diff>

<commit_message>
Update 周一 2026/10/26 17:57:35
</commit_message>
<xml_diff>
--- a/模板库/ku/ISO 2023.docx
+++ b/模板库/ku/ISO 2023.docx
@@ -815,7 +815,97 @@
         </w:rPr>
         <w:t>和U</w:t>
       </w:r>
+      <w:r>
+        <w:rPr>
+          <w:rFonts w:hint="eastAsia" w:ascii="宋体" w:hAnsi="宋体" w:eastAsia="宋体" w:cs="宋体"/>
+          <w:b w:val="0"/>
+          <w:bCs/>
+          <w:color w:val="auto"/>
+          <w:sz w:val="21"/>
+          <w:szCs w:val="21"/>
+          <w:vertAlign w:val="subscript"/>
+          <w:lang w:val="en-US" w:eastAsia="zh-CN"/>
+        </w:rPr>
+        <w:t>X</w:t>
+      </w:r>
+      <w:r>
+        <w:rPr>
+          <w:rFonts w:hint="eastAsia" w:ascii="宋体" w:hAnsi="宋体" w:eastAsia="宋体" w:cs="宋体"/>
+          <w:b w:val="0"/>
+          <w:bCs/>
+          <w:color w:val="auto"/>
+          <w:sz w:val="21"/>
+          <w:szCs w:val="21"/>
+          <w:lang w:val="en-US" w:eastAsia="zh-CN"/>
+        </w:rPr>
+        <w:t>通过电气连接进行电控操作。此外，还配备有辅助设备（例如冷却系统）。运行模式（最小、典型、最大）应由客户与供应商协商确定。为避免DUT过热或无法完成测试设置，客户与供应商可协商将运行模式从4.4改为4.2。</w:t>
+      </w:r>
+    </w:p>
+    <w:p>
+      <w:pPr>
+        <w:spacing w:line="360" w:lineRule="auto"/>
+        <w:jc w:val="left"/>
+        <w:rPr>
+          <w:rFonts w:hint="eastAsia" w:ascii="宋体" w:hAnsi="宋体" w:eastAsia="宋体" w:cs="宋体"/>
+          <w:b w:val="0"/>
+          <w:bCs/>
+          <w:color w:val="auto"/>
+          <w:sz w:val="21"/>
+          <w:szCs w:val="21"/>
+          <w:lang w:val="en-US" w:eastAsia="zh-CN"/>
+        </w:rPr>
+      </w:pPr>
+      <w:r>
+        <w:rPr>
+          <w:rFonts w:hint="eastAsia" w:ascii="宋体" w:hAnsi="宋体" w:eastAsia="宋体" w:cs="宋体"/>
+          <w:b w:val="0"/>
+          <w:bCs/>
+          <w:color w:val="auto"/>
+          <w:sz w:val="21"/>
+          <w:szCs w:val="21"/>
+          <w:lang w:val="en-US" w:eastAsia="zh-CN"/>
+        </w:rPr>
+        <w:t>若待测设备具有48V电路但未配备B类电压电路，则应使用U</w:t>
+      </w:r>
+      <w:r>
+        <w:rPr>
+          <w:rFonts w:hint="eastAsia" w:ascii="宋体" w:hAnsi="宋体" w:eastAsia="宋体" w:cs="宋体"/>
+          <w:b w:val="0"/>
+          <w:bCs/>
+          <w:color w:val="auto"/>
+          <w:sz w:val="21"/>
+          <w:szCs w:val="21"/>
+          <w:vertAlign w:val="subscript"/>
+          <w:lang w:val="en-US" w:eastAsia="zh-CN"/>
+        </w:rPr>
+        <w:t>48N</w:t>
+      </w:r>
+      <w:r>
+        <w:rPr>
+          <w:rFonts w:hint="eastAsia" w:ascii="宋体" w:hAnsi="宋体" w:eastAsia="宋体" w:cs="宋体"/>
+          <w:b w:val="0"/>
+          <w:bCs/>
+          <w:color w:val="auto"/>
+          <w:sz w:val="21"/>
+          <w:szCs w:val="21"/>
+          <w:lang w:val="en-US" w:eastAsia="zh-CN"/>
+        </w:rPr>
+        <w:t>替代</w:t>
+      </w:r>
       <w:bookmarkStart w:id="0" w:name="_GoBack"/>
+      <w:bookmarkEnd w:id="0"/>
+      <w:r>
+        <w:rPr>
+          <w:rFonts w:hint="eastAsia" w:ascii="宋体" w:hAnsi="宋体" w:eastAsia="宋体" w:cs="宋体"/>
+          <w:b w:val="0"/>
+          <w:bCs/>
+          <w:color w:val="auto"/>
+          <w:sz w:val="21"/>
+          <w:szCs w:val="21"/>
+          <w:lang w:val="en-US" w:eastAsia="zh-CN"/>
+        </w:rPr>
+        <w:t>U</w:t>
+      </w:r>
       <w:r>
         <w:rPr>
           <w:rFonts w:hint="eastAsia" w:ascii="宋体" w:hAnsi="宋体" w:eastAsia="宋体" w:cs="宋体"/>
@@ -829,45 +919,17 @@
         </w:rPr>
         <w:t>X</w:t>
       </w:r>
-      <w:bookmarkEnd w:id="0"/>
-      <w:r>
-        <w:rPr>
-          <w:rFonts w:hint="eastAsia" w:ascii="宋体" w:hAnsi="宋体" w:eastAsia="宋体" w:cs="宋体"/>
-          <w:b w:val="0"/>
-          <w:bCs/>
-          <w:color w:val="auto"/>
-          <w:sz w:val="21"/>
-          <w:szCs w:val="21"/>
-          <w:lang w:val="en-US" w:eastAsia="zh-CN"/>
-        </w:rPr>
-        <w:t>通过电气连接进行电控操作。此外，还配备有辅助设备（例如冷却系统）。运行模式（最小、典型、最大）应由客户与供应商协商确定。为避免DUT过热或无法完成测试设置，客户与供应商可协商将运行模式从4.4改为4.2。</w:t>
-      </w:r>
-    </w:p>
-    <w:p>
-      <w:pPr>
-        <w:spacing w:line="360" w:lineRule="auto"/>
-        <w:jc w:val="left"/>
-        <w:rPr>
-          <w:rFonts w:hint="eastAsia" w:ascii="宋体" w:hAnsi="宋体" w:eastAsia="宋体" w:cs="宋体"/>
-          <w:b w:val="0"/>
-          <w:bCs/>
-          <w:color w:val="auto"/>
-          <w:sz w:val="21"/>
-          <w:szCs w:val="21"/>
-          <w:lang w:val="en-US" w:eastAsia="zh-CN"/>
-        </w:rPr>
-      </w:pPr>
-      <w:r>
-        <w:rPr>
-          <w:rFonts w:hint="eastAsia" w:ascii="宋体" w:hAnsi="宋体" w:eastAsia="宋体" w:cs="宋体"/>
-          <w:b w:val="0"/>
-          <w:bCs/>
-          <w:color w:val="auto"/>
-          <w:sz w:val="21"/>
-          <w:szCs w:val="21"/>
-          <w:lang w:val="en-US" w:eastAsia="zh-CN"/>
-        </w:rPr>
-        <w:t>若待测设备具有48V电路但未配备B类电压电路，则应使用U48N替代UX。若待测设备仅具备12/24V电路，则仅提供12/24V电压。为了特定的测试情况、其他测试电压或其他电压曲线可能适用。</w:t>
+      <w:r>
+        <w:rPr>
+          <w:rFonts w:hint="eastAsia" w:ascii="宋体" w:hAnsi="宋体" w:eastAsia="宋体" w:cs="宋体"/>
+          <w:b w:val="0"/>
+          <w:bCs/>
+          <w:color w:val="auto"/>
+          <w:sz w:val="21"/>
+          <w:szCs w:val="21"/>
+          <w:lang w:val="en-US" w:eastAsia="zh-CN"/>
+        </w:rPr>
+        <w:t>。若待测设备仅具备12/24V电路，则仅提供12/24V电压。为了特定的测试情况、其他测试电压或其他电压曲线可能适用。</w:t>
       </w:r>
     </w:p>
     <w:p>

</xml_diff>